<commit_message>
RCI Report Format Change
</commit_message>
<xml_diff>
--- a/backend/backend/assets/rci_plan_template.docx
+++ b/backend/backend/assets/rci_plan_template.docx
@@ -23,12 +23,12 @@
         <w:tblLook w:val="0660" w:firstRow="1" w:lastRow="1" w:firstColumn="0" w:lastColumn="0" w:noHBand="1" w:noVBand="1"/>
       </w:tblPr>
       <w:tblGrid>
-        <w:gridCol w:w="429"/>
-        <w:gridCol w:w="2920"/>
-        <w:gridCol w:w="1986"/>
-        <w:gridCol w:w="1843"/>
-        <w:gridCol w:w="1986"/>
-        <w:gridCol w:w="2175"/>
+        <w:gridCol w:w="424"/>
+        <w:gridCol w:w="2884"/>
+        <w:gridCol w:w="1961"/>
+        <w:gridCol w:w="1820"/>
+        <w:gridCol w:w="1961"/>
+        <w:gridCol w:w="2148"/>
       </w:tblGrid>
       <w:tr>
         <w:trPr>
@@ -732,6 +732,7 @@
             <w:tr>
               <w:trPr>
                 <w:trHeight w:val="271"/>
+                <w:tblHeader/>
               </w:trPr>
               <w:tc>
                 <w:tcPr>
@@ -3159,7 +3160,7 @@
               <w:pStyle w:val="ListParagraph"/>
               <w:numPr>
                 <w:ilvl w:val="0"/>
-                <w:numId w:val="8"/>
+                <w:numId w:val="1"/>
               </w:numPr>
               <w:rPr>
                 <w:rFonts w:eastAsia="Calibri"/>
@@ -3382,39 +3383,18 @@
     </w:p>
     <w:p/>
     <w:sectPr>
-      <w:headerReference w:type="even" r:id="rId7"/>
-      <w:headerReference w:type="default" r:id="rId8"/>
-      <w:footerReference w:type="even" r:id="rId9"/>
-      <w:footerReference w:type="default" r:id="rId10"/>
-      <w:headerReference w:type="first" r:id="rId11"/>
-      <w:footerReference w:type="first" r:id="rId12"/>
-      <w:pgSz w:w="11906" w:h="16838" w:code="9"/>
-      <w:pgMar w:top="1440" w:right="566" w:bottom="187" w:left="1134" w:header="851" w:footer="542" w:gutter="0"/>
-      <w:pgNumType w:start="1"/>
+      <w:headerReference w:type="default" r:id="rId5"/>
+      <w:footerReference w:type="default" r:id="rId6"/>
+      <w:headerReference w:type="first" r:id="rId7"/>
+      <w:footerReference w:type="first" r:id="rId8"/>
+      <w:pgSz w:w="12240" w:h="15840"/>
+      <w:pgMar w:top="1440" w:right="720" w:bottom="1135" w:left="1440" w:header="720" w:footer="162" w:gutter="0"/>
       <w:cols w:space="720"/>
+      <w:titlePg/>
       <w:docGrid w:linePitch="360"/>
     </w:sectPr>
   </w:body>
 </w:document>
-</file>
-
-<file path=word/endnotes.xml><?xml version="1.0" encoding="utf-8"?>
-<w:endnotes xmlns:wpc="http://schemas.microsoft.com/office/word/2010/wordprocessingCanvas" xmlns:cx="http://schemas.microsoft.com/office/drawing/2014/chartex" xmlns:cx1="http://schemas.microsoft.com/office/drawing/2015/9/8/chartex" xmlns:cx2="http://schemas.microsoft.com/office/drawing/2015/10/21/chartex" xmlns:cx3="http://schemas.microsoft.com/office/drawing/2016/5/9/chartex" xmlns:cx4="http://schemas.microsoft.com/office/drawing/2016/5/10/chartex" xmlns:cx5="http://schemas.microsoft.com/office/drawing/2016/5/11/chartex" xmlns:cx6="http://schemas.microsoft.com/office/drawing/2016/5/12/chartex" xmlns:cx7="http://schemas.microsoft.com/office/drawing/2016/5/13/chartex" xmlns:cx8="http://schemas.microsoft.com/office/drawing/2016/5/14/chartex" xmlns:mc="http://schemas.openxmlformats.org/markup-compatibility/2006" xmlns:aink="http://schemas.microsoft.com/office/drawing/2016/ink" xmlns:am3d="http://schemas.microsoft.com/office/drawing/2017/model3d" xmlns:o="urn:schemas-microsoft-com:office:office" xmlns:oel="http://schemas.microsoft.com/office/2019/extlst" xmlns:r="http://schemas.openxmlformats.org/officeDocument/2006/relationships" xmlns:m="http://schemas.openxmlformats.org/officeDocument/2006/math" xmlns:v="urn:schemas-microsoft-com:vml" xmlns:wp14="http://schemas.microsoft.com/office/word/2010/wordprocessingDrawing" xmlns:wp="http://schemas.openxmlformats.org/drawingml/2006/wordprocessingDrawing" xmlns:w10="urn:schemas-microsoft-com:office:word" xmlns:w="http://schemas.openxmlformats.org/wordprocessingml/2006/main" xmlns:w14="http://schemas.microsoft.com/office/word/2010/wordml" xmlns:w15="http://schemas.microsoft.com/office/word/2012/wordml" xmlns:w16cei="http://schemas.microsoft.com/office/word/2026/wordml/cei" xmlns:w16cex="http://schemas.microsoft.com/office/word/2018/wordml/cex" xmlns:w16cid="http://schemas.microsoft.com/office/word/2016/wordml/cid" xmlns:w16="http://schemas.microsoft.com/office/word/2018/wordml" xmlns:w16du="http://schemas.microsoft.com/office/word/2023/wordml/word16du" xmlns:w16sdtdh="http://schemas.microsoft.com/office/word/2020/wordml/sdtdatahash" xmlns:w16sdtfl="http://schemas.microsoft.com/office/word/2024/wordml/sdtformatlock" xmlns:w16se="http://schemas.microsoft.com/office/word/2015/wordml/symex" xmlns:wpg="http://schemas.microsoft.com/office/word/2010/wordprocessingGroup" xmlns:wpi="http://schemas.microsoft.com/office/word/2010/wordprocessingInk" xmlns:wne="http://schemas.microsoft.com/office/word/2006/wordml" xmlns:wps="http://schemas.microsoft.com/office/word/2010/wordprocessingShape" mc:Ignorable="w14 w15 w16se w16cid w16 w16cex w16sdtdh w16sdtfl w16du wp14">
-  <w:endnote w:type="separator" w:id="-1">
-    <w:p>
-      <w:r>
-        <w:separator/>
-      </w:r>
-    </w:p>
-  </w:endnote>
-  <w:endnote w:type="continuationSeparator" w:id="0">
-    <w:p>
-      <w:r>
-        <w:continuationSeparator/>
-      </w:r>
-    </w:p>
-  </w:endnote>
-</w:endnotes>
 </file>
 
 <file path=word/footer1.xml><?xml version="1.0" encoding="utf-8"?>
@@ -3422,6 +3402,205 @@
   <w:p>
     <w:pPr>
       <w:pStyle w:val="Footer"/>
+      <w:rPr>
+        <w:rFonts w:ascii="Arial" w:hAnsi="Arial" w:cs="Arial"/>
+        <w:sz w:val="22"/>
+        <w:szCs w:val="22"/>
+      </w:rPr>
+    </w:pPr>
+    <w:r>
+      <w:rPr>
+        <w:rFonts w:ascii="Arial" w:hAnsi="Arial" w:cs="Arial"/>
+        <w:sz w:val="20"/>
+        <w:szCs w:val="20"/>
+      </w:rPr>
+      <w:t xml:space="preserve">                                                              </w:t>
+    </w:r>
+  </w:p>
+  <w:p>
+    <w:pPr>
+      <w:pStyle w:val="Footer"/>
+      <w:jc w:val="center"/>
+      <w:rPr>
+        <w:sz w:val="22"/>
+        <w:szCs w:val="22"/>
+      </w:rPr>
+    </w:pPr>
+    <w:r>
+      <w:rPr>
+        <w:sz w:val="22"/>
+        <w:szCs w:val="22"/>
+      </w:rPr>
+      <w:t xml:space="preserve">Page </w:t>
+    </w:r>
+    <w:r>
+      <w:rPr>
+        <w:sz w:val="22"/>
+        <w:szCs w:val="22"/>
+      </w:rPr>
+      <w:fldChar w:fldCharType="begin"/>
+    </w:r>
+    <w:r>
+      <w:rPr>
+        <w:sz w:val="22"/>
+        <w:szCs w:val="22"/>
+      </w:rPr>
+      <w:instrText xml:space="preserve"> PAGE </w:instrText>
+    </w:r>
+    <w:r>
+      <w:rPr>
+        <w:sz w:val="22"/>
+        <w:szCs w:val="22"/>
+      </w:rPr>
+      <w:fldChar w:fldCharType="separate"/>
+    </w:r>
+    <w:r>
+      <w:rPr>
+        <w:sz w:val="22"/>
+        <w:szCs w:val="22"/>
+      </w:rPr>
+      <w:t>1</w:t>
+    </w:r>
+    <w:r>
+      <w:rPr>
+        <w:sz w:val="22"/>
+        <w:szCs w:val="22"/>
+      </w:rPr>
+      <w:fldChar w:fldCharType="end"/>
+    </w:r>
+    <w:r>
+      <w:rPr>
+        <w:sz w:val="22"/>
+        <w:szCs w:val="22"/>
+      </w:rPr>
+      <w:t xml:space="preserve"> of </w:t>
+    </w:r>
+    <w:r>
+      <w:rPr>
+        <w:sz w:val="22"/>
+        <w:szCs w:val="22"/>
+      </w:rPr>
+      <w:fldChar w:fldCharType="begin"/>
+    </w:r>
+    <w:r>
+      <w:rPr>
+        <w:sz w:val="22"/>
+        <w:szCs w:val="22"/>
+      </w:rPr>
+      <w:instrText xml:space="preserve"> NUMPAGES </w:instrText>
+    </w:r>
+    <w:r>
+      <w:rPr>
+        <w:sz w:val="22"/>
+        <w:szCs w:val="22"/>
+      </w:rPr>
+      <w:fldChar w:fldCharType="separate"/>
+    </w:r>
+    <w:r>
+      <w:rPr>
+        <w:sz w:val="22"/>
+        <w:szCs w:val="22"/>
+      </w:rPr>
+      <w:t>1</w:t>
+    </w:r>
+    <w:r>
+      <w:rPr>
+        <w:sz w:val="22"/>
+        <w:szCs w:val="22"/>
+      </w:rPr>
+      <w:fldChar w:fldCharType="end"/>
+    </w:r>
+  </w:p>
+  <w:p>
+    <w:pPr>
+      <w:pStyle w:val="Footer"/>
+      <w:jc w:val="right"/>
+      <w:rPr>
+        <w:sz w:val="22"/>
+        <w:szCs w:val="22"/>
+      </w:rPr>
+    </w:pPr>
+    <w:r>
+      <w:rPr>
+        <w:sz w:val="22"/>
+        <w:szCs w:val="22"/>
+      </w:rPr>
+      <w:t>GQA/070/F-01/R</w:t>
+    </w:r>
+    <w:r>
+      <w:rPr>
+        <w:sz w:val="22"/>
+        <w:szCs w:val="22"/>
+      </w:rPr>
+      <w:t>1</w:t>
+    </w:r>
+  </w:p>
+  <w:p>
+    <w:pPr>
+      <w:pStyle w:val="Footer"/>
+      <w:rPr>
+        <w:rFonts w:ascii="Arial" w:hAnsi="Arial" w:cs="Arial"/>
+        <w:sz w:val="20"/>
+        <w:szCs w:val="20"/>
+      </w:rPr>
+    </w:pPr>
+  </w:p>
+  <w:p>
+    <w:pPr>
+      <w:pStyle w:val="Footer"/>
+      <w:rPr>
+        <w:rFonts w:ascii="Arial" w:hAnsi="Arial" w:cs="Arial"/>
+        <w:sz w:val="20"/>
+        <w:szCs w:val="20"/>
+      </w:rPr>
+    </w:pPr>
+  </w:p>
+  <w:p>
+    <w:pPr>
+      <w:pStyle w:val="Footer"/>
+      <w:tabs>
+        <w:tab w:val="clear" w:pos="4680"/>
+        <w:tab w:val="clear" w:pos="9360"/>
+        <w:tab w:val="left" w:pos="3045"/>
+      </w:tabs>
+      <w:rPr>
+        <w:rFonts w:ascii="Arial" w:hAnsi="Arial" w:cs="Arial"/>
+        <w:sz w:val="20"/>
+        <w:szCs w:val="20"/>
+      </w:rPr>
+    </w:pPr>
+    <w:r>
+      <w:rPr>
+        <w:rFonts w:ascii="Arial" w:hAnsi="Arial" w:cs="Arial"/>
+        <w:sz w:val="20"/>
+        <w:szCs w:val="20"/>
+      </w:rPr>
+      <w:tab/>
+    </w:r>
+  </w:p>
+  <w:p>
+    <w:pPr>
+      <w:pStyle w:val="Footer"/>
+      <w:rPr>
+        <w:rFonts w:ascii="Arial" w:hAnsi="Arial" w:cs="Arial"/>
+        <w:sz w:val="20"/>
+        <w:szCs w:val="20"/>
+      </w:rPr>
+    </w:pPr>
+    <w:r>
+      <w:rPr>
+        <w:rFonts w:ascii="Arial" w:hAnsi="Arial" w:cs="Arial"/>
+        <w:bCs/>
+        <w:sz w:val="20"/>
+        <w:szCs w:val="20"/>
+      </w:rPr>
+      <w:t xml:space="preserve">                                                                    </w:t>
+    </w:r>
+  </w:p>
+  <w:p>
+    <w:pPr>
+      <w:pStyle w:val="Footer"/>
+      <w:jc w:val="center"/>
     </w:pPr>
   </w:p>
 </w:ftr>
@@ -3432,31 +3611,95 @@
   <w:p>
     <w:pPr>
       <w:pStyle w:val="Footer"/>
-      <w:pBdr>
-        <w:bottom w:val="single" w:sz="6" w:space="1" w:color="auto"/>
-      </w:pBdr>
       <w:jc w:val="center"/>
       <w:rPr>
-        <w:sz w:val="4"/>
-        <w:szCs w:val="4"/>
-      </w:rPr>
-    </w:pPr>
-  </w:p>
-  <w:p>
-    <w:pPr>
-      <w:pStyle w:val="Footer"/>
-      <w:jc w:val="center"/>
-      <w:rPr>
-        <w:sz w:val="22"/>
-        <w:szCs w:val="22"/>
+        <w:sz w:val="20"/>
+        <w:szCs w:val="20"/>
       </w:rPr>
     </w:pPr>
     <w:r>
       <w:rPr>
-        <w:sz w:val="22"/>
-        <w:szCs w:val="22"/>
-      </w:rPr>
-      <w:t>Page X of Y</w:t>
+        <w:sz w:val="20"/>
+        <w:szCs w:val="20"/>
+      </w:rPr>
+      <w:t xml:space="preserve">Page </w:t>
+    </w:r>
+    <w:r>
+      <w:rPr>
+        <w:sz w:val="20"/>
+        <w:szCs w:val="20"/>
+      </w:rPr>
+      <w:fldChar w:fldCharType="begin"/>
+    </w:r>
+    <w:r>
+      <w:rPr>
+        <w:sz w:val="20"/>
+        <w:szCs w:val="20"/>
+      </w:rPr>
+      <w:instrText xml:space="preserve"> PAGE </w:instrText>
+    </w:r>
+    <w:r>
+      <w:rPr>
+        <w:sz w:val="20"/>
+        <w:szCs w:val="20"/>
+      </w:rPr>
+      <w:fldChar w:fldCharType="separate"/>
+    </w:r>
+    <w:r>
+      <w:rPr>
+        <w:sz w:val="20"/>
+        <w:szCs w:val="20"/>
+      </w:rPr>
+      <w:t>1</w:t>
+    </w:r>
+    <w:r>
+      <w:rPr>
+        <w:sz w:val="20"/>
+        <w:szCs w:val="20"/>
+      </w:rPr>
+      <w:fldChar w:fldCharType="end"/>
+    </w:r>
+    <w:r>
+      <w:rPr>
+        <w:sz w:val="20"/>
+        <w:szCs w:val="20"/>
+      </w:rPr>
+      <w:t xml:space="preserve"> of </w:t>
+    </w:r>
+    <w:r>
+      <w:rPr>
+        <w:sz w:val="20"/>
+        <w:szCs w:val="20"/>
+      </w:rPr>
+      <w:fldChar w:fldCharType="begin"/>
+    </w:r>
+    <w:r>
+      <w:rPr>
+        <w:sz w:val="20"/>
+        <w:szCs w:val="20"/>
+      </w:rPr>
+      <w:instrText xml:space="preserve"> NUMPAGES </w:instrText>
+    </w:r>
+    <w:r>
+      <w:rPr>
+        <w:sz w:val="20"/>
+        <w:szCs w:val="20"/>
+      </w:rPr>
+      <w:fldChar w:fldCharType="separate"/>
+    </w:r>
+    <w:r>
+      <w:rPr>
+        <w:sz w:val="20"/>
+        <w:szCs w:val="20"/>
+      </w:rPr>
+      <w:t>1</w:t>
+    </w:r>
+    <w:r>
+      <w:rPr>
+        <w:sz w:val="20"/>
+        <w:szCs w:val="20"/>
+      </w:rPr>
+      <w:fldChar w:fldCharType="end"/>
     </w:r>
   </w:p>
   <w:p>
@@ -3473,14 +3716,16 @@
         <w:sz w:val="22"/>
         <w:szCs w:val="22"/>
       </w:rPr>
-      <w:t>GQA/070/F-04/R3</w:t>
+      <w:t>GQA/070/F-01/R</w:t>
+    </w:r>
+    <w:r>
+      <w:rPr>
+        <w:sz w:val="20"/>
+        <w:szCs w:val="20"/>
+      </w:rPr>
+      <w:t xml:space="preserve">                                                     </w:t>
     </w:r>
   </w:p>
-</w:ftr>
-</file>
-
-<file path=word/footer3.xml><?xml version="1.0" encoding="utf-8"?>
-<w:ftr xmlns:wpc="http://schemas.microsoft.com/office/word/2010/wordprocessingCanvas" xmlns:cx="http://schemas.microsoft.com/office/drawing/2014/chartex" xmlns:cx1="http://schemas.microsoft.com/office/drawing/2015/9/8/chartex" xmlns:cx2="http://schemas.microsoft.com/office/drawing/2015/10/21/chartex" xmlns:cx3="http://schemas.microsoft.com/office/drawing/2016/5/9/chartex" xmlns:cx4="http://schemas.microsoft.com/office/drawing/2016/5/10/chartex" xmlns:cx5="http://schemas.microsoft.com/office/drawing/2016/5/11/chartex" xmlns:cx6="http://schemas.microsoft.com/office/drawing/2016/5/12/chartex" xmlns:cx7="http://schemas.microsoft.com/office/drawing/2016/5/13/chartex" xmlns:cx8="http://schemas.microsoft.com/office/drawing/2016/5/14/chartex" xmlns:mc="http://schemas.openxmlformats.org/markup-compatibility/2006" xmlns:aink="http://schemas.microsoft.com/office/drawing/2016/ink" xmlns:am3d="http://schemas.microsoft.com/office/drawing/2017/model3d" xmlns:o="urn:schemas-microsoft-com:office:office" xmlns:oel="http://schemas.microsoft.com/office/2019/extlst" xmlns:r="http://schemas.openxmlformats.org/officeDocument/2006/relationships" xmlns:m="http://schemas.openxmlformats.org/officeDocument/2006/math" xmlns:v="urn:schemas-microsoft-com:vml" xmlns:wp14="http://schemas.microsoft.com/office/word/2010/wordprocessingDrawing" xmlns:wp="http://schemas.openxmlformats.org/drawingml/2006/wordprocessingDrawing" xmlns:w10="urn:schemas-microsoft-com:office:word" xmlns:w="http://schemas.openxmlformats.org/wordprocessingml/2006/main" xmlns:w14="http://schemas.microsoft.com/office/word/2010/wordml" xmlns:w15="http://schemas.microsoft.com/office/word/2012/wordml" xmlns:w16cei="http://schemas.microsoft.com/office/word/2026/wordml/cei" xmlns:w16cex="http://schemas.microsoft.com/office/word/2018/wordml/cex" xmlns:w16cid="http://schemas.microsoft.com/office/word/2016/wordml/cid" xmlns:w16="http://schemas.microsoft.com/office/word/2018/wordml" xmlns:w16du="http://schemas.microsoft.com/office/word/2023/wordml/word16du" xmlns:w16sdtdh="http://schemas.microsoft.com/office/word/2020/wordml/sdtdatahash" xmlns:w16sdtfl="http://schemas.microsoft.com/office/word/2024/wordml/sdtformatlock" xmlns:w16se="http://schemas.microsoft.com/office/word/2015/wordml/symex" xmlns:wpg="http://schemas.microsoft.com/office/word/2010/wordprocessingGroup" xmlns:wpi="http://schemas.microsoft.com/office/word/2010/wordprocessingInk" xmlns:wne="http://schemas.microsoft.com/office/word/2006/wordml" xmlns:wps="http://schemas.microsoft.com/office/word/2010/wordprocessingShape" mc:Ignorable="w14 w15 w16se w16cid w16 w16cex w16sdtdh w16sdtfl w16du wp14">
   <w:p>
     <w:pPr>
       <w:pStyle w:val="Footer"/>
@@ -3489,27 +3734,134 @@
 </w:ftr>
 </file>
 
-<file path=word/footnotes.xml><?xml version="1.0" encoding="utf-8"?>
-<w:footnotes xmlns:wpc="http://schemas.microsoft.com/office/word/2010/wordprocessingCanvas" xmlns:cx="http://schemas.microsoft.com/office/drawing/2014/chartex" xmlns:cx1="http://schemas.microsoft.com/office/drawing/2015/9/8/chartex" xmlns:cx2="http://schemas.microsoft.com/office/drawing/2015/10/21/chartex" xmlns:cx3="http://schemas.microsoft.com/office/drawing/2016/5/9/chartex" xmlns:cx4="http://schemas.microsoft.com/office/drawing/2016/5/10/chartex" xmlns:cx5="http://schemas.microsoft.com/office/drawing/2016/5/11/chartex" xmlns:cx6="http://schemas.microsoft.com/office/drawing/2016/5/12/chartex" xmlns:cx7="http://schemas.microsoft.com/office/drawing/2016/5/13/chartex" xmlns:cx8="http://schemas.microsoft.com/office/drawing/2016/5/14/chartex" xmlns:mc="http://schemas.openxmlformats.org/markup-compatibility/2006" xmlns:aink="http://schemas.microsoft.com/office/drawing/2016/ink" xmlns:am3d="http://schemas.microsoft.com/office/drawing/2017/model3d" xmlns:o="urn:schemas-microsoft-com:office:office" xmlns:oel="http://schemas.microsoft.com/office/2019/extlst" xmlns:r="http://schemas.openxmlformats.org/officeDocument/2006/relationships" xmlns:m="http://schemas.openxmlformats.org/officeDocument/2006/math" xmlns:v="urn:schemas-microsoft-com:vml" xmlns:wp14="http://schemas.microsoft.com/office/word/2010/wordprocessingDrawing" xmlns:wp="http://schemas.openxmlformats.org/drawingml/2006/wordprocessingDrawing" xmlns:w10="urn:schemas-microsoft-com:office:word" xmlns:w="http://schemas.openxmlformats.org/wordprocessingml/2006/main" xmlns:w14="http://schemas.microsoft.com/office/word/2010/wordml" xmlns:w15="http://schemas.microsoft.com/office/word/2012/wordml" xmlns:w16cei="http://schemas.microsoft.com/office/word/2026/wordml/cei" xmlns:w16cex="http://schemas.microsoft.com/office/word/2018/wordml/cex" xmlns:w16cid="http://schemas.microsoft.com/office/word/2016/wordml/cid" xmlns:w16="http://schemas.microsoft.com/office/word/2018/wordml" xmlns:w16du="http://schemas.microsoft.com/office/word/2023/wordml/word16du" xmlns:w16sdtdh="http://schemas.microsoft.com/office/word/2020/wordml/sdtdatahash" xmlns:w16sdtfl="http://schemas.microsoft.com/office/word/2024/wordml/sdtformatlock" xmlns:w16se="http://schemas.microsoft.com/office/word/2015/wordml/symex" xmlns:wpg="http://schemas.microsoft.com/office/word/2010/wordprocessingGroup" xmlns:wpi="http://schemas.microsoft.com/office/word/2010/wordprocessingInk" xmlns:wne="http://schemas.microsoft.com/office/word/2006/wordml" xmlns:wps="http://schemas.microsoft.com/office/word/2010/wordprocessingShape" mc:Ignorable="w14 w15 w16se w16cid w16 w16cex w16sdtdh w16sdtfl w16du wp14">
-  <w:footnote w:type="separator" w:id="-1">
-    <w:p>
-      <w:r>
-        <w:separator/>
-      </w:r>
-    </w:p>
-  </w:footnote>
-  <w:footnote w:type="continuationSeparator" w:id="0">
-    <w:p>
-      <w:r>
-        <w:continuationSeparator/>
-      </w:r>
-    </w:p>
-  </w:footnote>
-</w:footnotes>
-</file>
-
 <file path=word/header1.xml><?xml version="1.0" encoding="utf-8"?>
 <w:hdr xmlns:wpc="http://schemas.microsoft.com/office/word/2010/wordprocessingCanvas" xmlns:cx="http://schemas.microsoft.com/office/drawing/2014/chartex" xmlns:cx1="http://schemas.microsoft.com/office/drawing/2015/9/8/chartex" xmlns:cx2="http://schemas.microsoft.com/office/drawing/2015/10/21/chartex" xmlns:cx3="http://schemas.microsoft.com/office/drawing/2016/5/9/chartex" xmlns:cx4="http://schemas.microsoft.com/office/drawing/2016/5/10/chartex" xmlns:cx5="http://schemas.microsoft.com/office/drawing/2016/5/11/chartex" xmlns:cx6="http://schemas.microsoft.com/office/drawing/2016/5/12/chartex" xmlns:cx7="http://schemas.microsoft.com/office/drawing/2016/5/13/chartex" xmlns:cx8="http://schemas.microsoft.com/office/drawing/2016/5/14/chartex" xmlns:mc="http://schemas.openxmlformats.org/markup-compatibility/2006" xmlns:aink="http://schemas.microsoft.com/office/drawing/2016/ink" xmlns:am3d="http://schemas.microsoft.com/office/drawing/2017/model3d" xmlns:o="urn:schemas-microsoft-com:office:office" xmlns:oel="http://schemas.microsoft.com/office/2019/extlst" xmlns:r="http://schemas.openxmlformats.org/officeDocument/2006/relationships" xmlns:m="http://schemas.openxmlformats.org/officeDocument/2006/math" xmlns:v="urn:schemas-microsoft-com:vml" xmlns:wp14="http://schemas.microsoft.com/office/word/2010/wordprocessingDrawing" xmlns:wp="http://schemas.openxmlformats.org/drawingml/2006/wordprocessingDrawing" xmlns:w10="urn:schemas-microsoft-com:office:word" xmlns:w="http://schemas.openxmlformats.org/wordprocessingml/2006/main" xmlns:w14="http://schemas.microsoft.com/office/word/2010/wordml" xmlns:w15="http://schemas.microsoft.com/office/word/2012/wordml" xmlns:w16cei="http://schemas.microsoft.com/office/word/2026/wordml/cei" xmlns:w16cex="http://schemas.microsoft.com/office/word/2018/wordml/cex" xmlns:w16cid="http://schemas.microsoft.com/office/word/2016/wordml/cid" xmlns:w16="http://schemas.microsoft.com/office/word/2018/wordml" xmlns:w16du="http://schemas.microsoft.com/office/word/2023/wordml/word16du" xmlns:w16sdtdh="http://schemas.microsoft.com/office/word/2020/wordml/sdtdatahash" xmlns:w16sdtfl="http://schemas.microsoft.com/office/word/2024/wordml/sdtformatlock" xmlns:w16se="http://schemas.microsoft.com/office/word/2015/wordml/symex" xmlns:wpg="http://schemas.microsoft.com/office/word/2010/wordprocessingGroup" xmlns:wpi="http://schemas.microsoft.com/office/word/2010/wordprocessingInk" xmlns:wne="http://schemas.microsoft.com/office/word/2006/wordml" xmlns:wps="http://schemas.microsoft.com/office/word/2010/wordprocessingShape" mc:Ignorable="w14 w15 w16se w16cid w16 w16cex w16sdtdh w16sdtfl w16du wp14">
+  <w:p>
+    <w:pPr>
+      <w:pStyle w:val="Header"/>
+      <w:ind w:hanging="284"/>
+      <w:rPr>
+        <w:b/>
+        <w:bCs/>
+        <w:noProof/>
+        <w:sz w:val="22"/>
+        <w:szCs w:val="22"/>
+        <w:lang w:val="en-IN" w:eastAsia="en-IN"/>
+      </w:rPr>
+    </w:pPr>
+    <w:r>
+      <w:rPr>
+        <w:b/>
+        <w:bCs/>
+        <w:noProof/>
+        <w:sz w:val="22"/>
+        <w:szCs w:val="22"/>
+        <w:lang w:val="en-IN" w:eastAsia="en-IN"/>
+      </w:rPr>
+    </w:r>
+    <w:r>
+      <w:drawing>
+        <wp:inline xmlns:a="http://schemas.openxmlformats.org/drawingml/2006/main" xmlns:pic="http://schemas.openxmlformats.org/drawingml/2006/picture">
+          <wp:extent cx="1043305" cy="390525"/>
+          <wp:docPr id="1" name="Picture 1"/>
+          <wp:cNvGraphicFramePr>
+            <a:graphicFrameLocks noChangeAspect="1"/>
+          </wp:cNvGraphicFramePr>
+          <a:graphic>
+            <a:graphicData uri="http://schemas.openxmlformats.org/drawingml/2006/picture">
+              <pic:pic>
+                <pic:nvPicPr>
+                  <pic:cNvPr id="0" name="image.jpg"/>
+                  <pic:cNvPicPr/>
+                </pic:nvPicPr>
+                <pic:blipFill>
+                  <a:blip r:embed="rId1"/>
+                  <a:stretch>
+                    <a:fillRect/>
+                  </a:stretch>
+                </pic:blipFill>
+                <pic:spPr>
+                  <a:xfrm>
+                    <a:off x="0" y="0"/>
+                    <a:ext cx="1043305" cy="390525"/>
+                  </a:xfrm>
+                  <a:prstGeom prst="rect"/>
+                </pic:spPr>
+              </pic:pic>
+            </a:graphicData>
+          </a:graphic>
+        </wp:inline>
+      </w:drawing>
+    </w:r>
+  </w:p>
+  <w:p>
+    <w:pPr>
+      <w:pStyle w:val="Header"/>
+      <w:ind w:hanging="284"/>
+      <w:rPr>
+        <w:b/>
+        <w:bCs/>
+        <w:noProof/>
+        <w:sz w:val="22"/>
+        <w:szCs w:val="22"/>
+        <w:lang w:val="en-IN" w:eastAsia="en-IN"/>
+      </w:rPr>
+    </w:pPr>
+    <w:r>
+      <w:rPr>
+        <w:b/>
+        <w:bCs/>
+        <w:noProof/>
+        <w:sz w:val="22"/>
+        <w:szCs w:val="22"/>
+        <w:lang w:val="en-IN" w:eastAsia="en-IN"/>
+      </w:rPr>
+      <w:t xml:space="preserve">KRSG                                                                                                                                           </w:t>
+    </w:r>
+    <w:r>
+      <w:rPr>
+        <w:b/>
+        <w:sz w:val="22"/>
+        <w:szCs w:val="22"/>
+      </w:rPr>
+      <w:t xml:space="preserve">Annexure 2 </w:t>
+    </w:r>
+  </w:p>
+  <w:p>
+    <w:pPr>
+      <w:pStyle w:val="Header"/>
+      <w:jc w:val="center"/>
+      <w:rPr>
+        <w:b/>
+        <w:sz w:val="22"/>
+        <w:szCs w:val="22"/>
+      </w:rPr>
+    </w:pPr>
+    <w:r>
+      <w:rPr>
+        <w:b/>
+        <w:sz w:val="22"/>
+        <w:szCs w:val="22"/>
+      </w:rPr>
+      <w:t>Root Cause I</w:t>
+    </w:r>
+    <w:r>
+      <w:rPr>
+        <w:b/>
+        <w:sz w:val="22"/>
+        <w:szCs w:val="22"/>
+      </w:rPr>
+      <w:t>nvestigation</w:t>
+    </w:r>
+    <w:r>
+      <w:rPr>
+        <w:b/>
+        <w:sz w:val="22"/>
+        <w:szCs w:val="22"/>
+      </w:rPr>
+      <w:t xml:space="preserve"> Plan</w:t>
+    </w:r>
+  </w:p>
   <w:p>
     <w:pPr>
       <w:pStyle w:val="Header"/>
@@ -3535,6 +3887,65 @@
     </w:pPr>
     <w:r>
       <w:rPr>
+        <w:noProof/>
+        <w:lang w:val="en-IN" w:eastAsia="en-IN"/>
+      </w:rPr>
+      <w:drawing>
+        <wp:inline distT="0" distB="0" distL="0" distR="0" wp14:anchorId="2FB595C9" wp14:editId="64401C41">
+          <wp:extent cx="1043305" cy="390525"/>
+          <wp:effectExtent l="0" t="0" r="4445" b="9525"/>
+          <wp:docPr id="1383126834" name="Picture 1" descr="The image depicts a clean, green logo featuring a stylized, intertwined 'S' symbol, symbolizing the brand 'Strides'.&#10;&#10;AI-generated content may be incorrect."/>
+          <wp:cNvGraphicFramePr>
+            <a:graphicFrameLocks xmlns:a="http://schemas.openxmlformats.org/drawingml/2006/main" noChangeAspect="1"/>
+          </wp:cNvGraphicFramePr>
+          <a:graphic xmlns:a="http://schemas.openxmlformats.org/drawingml/2006/main">
+            <a:graphicData uri="http://schemas.openxmlformats.org/drawingml/2006/picture">
+              <pic:pic xmlns:pic="http://schemas.openxmlformats.org/drawingml/2006/picture">
+                <pic:nvPicPr>
+                  <pic:cNvPr id="1383126834" name="Picture 1" descr="The image depicts a clean, green logo featuring a stylized, intertwined 'S' symbol, symbolizing the brand 'Strides'.&#10;&#10;AI-generated content may be incorrect."/>
+                  <pic:cNvPicPr>
+                    <a:picLocks noChangeAspect="1" noChangeArrowheads="1"/>
+                  </pic:cNvPicPr>
+                </pic:nvPicPr>
+                <pic:blipFill>
+                  <a:blip r:embed="rId1">
+                    <a:extLst>
+                      <a:ext uri="{28A0092B-C50C-407E-A947-70E740481C1C}">
+                        <a14:useLocalDpi xmlns:a14="http://schemas.microsoft.com/office/drawing/2010/main" val="0"/>
+                      </a:ext>
+                    </a:extLst>
+                  </a:blip>
+                  <a:srcRect/>
+                  <a:stretch>
+                    <a:fillRect/>
+                  </a:stretch>
+                </pic:blipFill>
+                <pic:spPr bwMode="auto">
+                  <a:xfrm>
+                    <a:off x="0" y="0"/>
+                    <a:ext cx="1043305" cy="390525"/>
+                  </a:xfrm>
+                  <a:prstGeom prst="rect">
+                    <a:avLst/>
+                  </a:prstGeom>
+                  <a:noFill/>
+                  <a:ln>
+                    <a:noFill/>
+                  </a:ln>
+                </pic:spPr>
+              </pic:pic>
+            </a:graphicData>
+          </a:graphic>
+        </wp:inline>
+      </w:drawing>
+    </w:r>
+  </w:p>
+  <w:p>
+    <w:pPr>
+      <w:pStyle w:val="Header"/>
+      <w:ind w:hanging="284"/>
+      <w:jc w:val="center"/>
+      <w:rPr>
         <w:b/>
         <w:bCs/>
         <w:noProof/>
@@ -3542,13 +3953,8 @@
         <w:szCs w:val="22"/>
         <w:lang w:val="en-IN" w:eastAsia="en-IN"/>
       </w:rPr>
-      <w:t>&lt;COMPANY LOGO&gt;</w:t>
-    </w:r>
-  </w:p>
-  <w:p>
-    <w:pPr>
-      <w:pStyle w:val="Header"/>
-      <w:ind w:hanging="284"/>
+    </w:pPr>
+    <w:r>
       <w:rPr>
         <w:b/>
         <w:bCs/>
@@ -3557,7 +3963,8 @@
         <w:szCs w:val="22"/>
         <w:lang w:val="en-IN" w:eastAsia="en-IN"/>
       </w:rPr>
-    </w:pPr>
+      <w:t>KRSG</w:t>
+    </w:r>
     <w:r>
       <w:rPr>
         <w:b/>
@@ -3567,7 +3974,7 @@
         <w:szCs w:val="22"/>
         <w:lang w:val="en-IN" w:eastAsia="en-IN"/>
       </w:rPr>
-      <w:t xml:space="preserve">&lt;LOCATION&gt;                                                                                                                                           </w:t>
+      <w:t xml:space="preserve">                                                                                                                                          </w:t>
     </w:r>
     <w:r>
       <w:rPr>
@@ -3575,7 +3982,7 @@
         <w:sz w:val="22"/>
         <w:szCs w:val="22"/>
       </w:rPr>
-      <w:t xml:space="preserve">Annexure 2 </w:t>
+      <w:t>Annexure 2</w:t>
     </w:r>
   </w:p>
   <w:p>
@@ -3616,41 +4023,7 @@
   <w:p>
     <w:pPr>
       <w:pStyle w:val="Header"/>
-      <w:tabs>
-        <w:tab w:val="clear" w:pos="9360"/>
-      </w:tabs>
-      <w:ind w:right="-1"/>
-      <w:jc w:val="right"/>
-      <w:rPr>
-        <w:sz w:val="22"/>
-        <w:szCs w:val="22"/>
-      </w:rPr>
-    </w:pPr>
-    <w:r>
-      <w:rPr>
-        <w:sz w:val="22"/>
-        <w:szCs w:val="22"/>
-      </w:rPr>
-      <w:t xml:space="preserve">                </w:t>
-    </w:r>
-  </w:p>
-  <w:p>
-    <w:pPr>
-      <w:pStyle w:val="Header"/>
-      <w:rPr>
-        <w:sz w:val="8"/>
-        <w:szCs w:val="8"/>
-      </w:rPr>
-    </w:pPr>
-  </w:p>
-</w:hdr>
-</file>
-
-<file path=word/header3.xml><?xml version="1.0" encoding="utf-8"?>
-<w:hdr xmlns:wpc="http://schemas.microsoft.com/office/word/2010/wordprocessingCanvas" xmlns:cx="http://schemas.microsoft.com/office/drawing/2014/chartex" xmlns:cx1="http://schemas.microsoft.com/office/drawing/2015/9/8/chartex" xmlns:cx2="http://schemas.microsoft.com/office/drawing/2015/10/21/chartex" xmlns:cx3="http://schemas.microsoft.com/office/drawing/2016/5/9/chartex" xmlns:cx4="http://schemas.microsoft.com/office/drawing/2016/5/10/chartex" xmlns:cx5="http://schemas.microsoft.com/office/drawing/2016/5/11/chartex" xmlns:cx6="http://schemas.microsoft.com/office/drawing/2016/5/12/chartex" xmlns:cx7="http://schemas.microsoft.com/office/drawing/2016/5/13/chartex" xmlns:cx8="http://schemas.microsoft.com/office/drawing/2016/5/14/chartex" xmlns:mc="http://schemas.openxmlformats.org/markup-compatibility/2006" xmlns:aink="http://schemas.microsoft.com/office/drawing/2016/ink" xmlns:am3d="http://schemas.microsoft.com/office/drawing/2017/model3d" xmlns:o="urn:schemas-microsoft-com:office:office" xmlns:oel="http://schemas.microsoft.com/office/2019/extlst" xmlns:r="http://schemas.openxmlformats.org/officeDocument/2006/relationships" xmlns:m="http://schemas.openxmlformats.org/officeDocument/2006/math" xmlns:v="urn:schemas-microsoft-com:vml" xmlns:wp14="http://schemas.microsoft.com/office/word/2010/wordprocessingDrawing" xmlns:wp="http://schemas.openxmlformats.org/drawingml/2006/wordprocessingDrawing" xmlns:w10="urn:schemas-microsoft-com:office:word" xmlns:w="http://schemas.openxmlformats.org/wordprocessingml/2006/main" xmlns:w14="http://schemas.microsoft.com/office/word/2010/wordml" xmlns:w15="http://schemas.microsoft.com/office/word/2012/wordml" xmlns:w16cei="http://schemas.microsoft.com/office/word/2026/wordml/cei" xmlns:w16cex="http://schemas.microsoft.com/office/word/2018/wordml/cex" xmlns:w16cid="http://schemas.microsoft.com/office/word/2016/wordml/cid" xmlns:w16="http://schemas.microsoft.com/office/word/2018/wordml" xmlns:w16du="http://schemas.microsoft.com/office/word/2023/wordml/word16du" xmlns:w16sdtdh="http://schemas.microsoft.com/office/word/2020/wordml/sdtdatahash" xmlns:w16sdtfl="http://schemas.microsoft.com/office/word/2024/wordml/sdtformatlock" xmlns:w16se="http://schemas.microsoft.com/office/word/2015/wordml/symex" xmlns:wpg="http://schemas.microsoft.com/office/word/2010/wordprocessingGroup" xmlns:wpi="http://schemas.microsoft.com/office/word/2010/wordprocessingInk" xmlns:wne="http://schemas.microsoft.com/office/word/2006/wordml" xmlns:wps="http://schemas.microsoft.com/office/word/2010/wordprocessingShape" mc:Ignorable="w14 w15 w16se w16cid w16 w16cex w16sdtdh w16sdtfl w16du wp14">
-  <w:p>
-    <w:pPr>
-      <w:pStyle w:val="Header"/>
+      <w:jc w:val="center"/>
     </w:pPr>
   </w:p>
 </w:hdr>
@@ -3770,851 +4143,7 @@
       </w:rPr>
     </w:lvl>
   </w:abstractNum>
-  <w:abstractNum w:abstractNumId="1" w15:restartNumberingAfterBreak="0">
-    <w:nsid w:val="2BFC2BA4"/>
-    <w:multiLevelType w:val="hybridMultilevel"/>
-    <w:tmpl w:val="F71A5C06"/>
-    <w:lvl w:ilvl="0" w:tplc="CFF2295E">
-      <w:start w:val="1"/>
-      <w:numFmt w:val="bullet"/>
-      <w:lvlText w:val=""/>
-      <w:lvlJc w:val="left"/>
-      <w:pPr>
-        <w:tabs>
-          <w:tab w:val="num" w:pos="720"/>
-        </w:tabs>
-        <w:ind w:left="720" w:hanging="360"/>
-      </w:pPr>
-      <w:rPr>
-        <w:rFonts w:ascii="Symbol" w:hAnsi="Symbol" w:hint="default"/>
-      </w:rPr>
-    </w:lvl>
-    <w:lvl w:ilvl="1" w:tplc="7EC4878A" w:tentative="1">
-      <w:start w:val="1"/>
-      <w:numFmt w:val="bullet"/>
-      <w:lvlText w:val=""/>
-      <w:lvlJc w:val="left"/>
-      <w:pPr>
-        <w:tabs>
-          <w:tab w:val="num" w:pos="1440"/>
-        </w:tabs>
-        <w:ind w:left="1440" w:hanging="360"/>
-      </w:pPr>
-      <w:rPr>
-        <w:rFonts w:ascii="Symbol" w:hAnsi="Symbol" w:hint="default"/>
-      </w:rPr>
-    </w:lvl>
-    <w:lvl w:ilvl="2" w:tplc="2C02BB10" w:tentative="1">
-      <w:start w:val="1"/>
-      <w:numFmt w:val="bullet"/>
-      <w:lvlText w:val=""/>
-      <w:lvlJc w:val="left"/>
-      <w:pPr>
-        <w:tabs>
-          <w:tab w:val="num" w:pos="2160"/>
-        </w:tabs>
-        <w:ind w:left="2160" w:hanging="360"/>
-      </w:pPr>
-      <w:rPr>
-        <w:rFonts w:ascii="Symbol" w:hAnsi="Symbol" w:hint="default"/>
-      </w:rPr>
-    </w:lvl>
-    <w:lvl w:ilvl="3" w:tplc="D6E0ED6E" w:tentative="1">
-      <w:start w:val="1"/>
-      <w:numFmt w:val="bullet"/>
-      <w:lvlText w:val=""/>
-      <w:lvlJc w:val="left"/>
-      <w:pPr>
-        <w:tabs>
-          <w:tab w:val="num" w:pos="2880"/>
-        </w:tabs>
-        <w:ind w:left="2880" w:hanging="360"/>
-      </w:pPr>
-      <w:rPr>
-        <w:rFonts w:ascii="Symbol" w:hAnsi="Symbol" w:hint="default"/>
-      </w:rPr>
-    </w:lvl>
-    <w:lvl w:ilvl="4" w:tplc="38242830" w:tentative="1">
-      <w:start w:val="1"/>
-      <w:numFmt w:val="bullet"/>
-      <w:lvlText w:val=""/>
-      <w:lvlJc w:val="left"/>
-      <w:pPr>
-        <w:tabs>
-          <w:tab w:val="num" w:pos="3600"/>
-        </w:tabs>
-        <w:ind w:left="3600" w:hanging="360"/>
-      </w:pPr>
-      <w:rPr>
-        <w:rFonts w:ascii="Symbol" w:hAnsi="Symbol" w:hint="default"/>
-      </w:rPr>
-    </w:lvl>
-    <w:lvl w:ilvl="5" w:tplc="1B946BF0" w:tentative="1">
-      <w:start w:val="1"/>
-      <w:numFmt w:val="bullet"/>
-      <w:lvlText w:val=""/>
-      <w:lvlJc w:val="left"/>
-      <w:pPr>
-        <w:tabs>
-          <w:tab w:val="num" w:pos="4320"/>
-        </w:tabs>
-        <w:ind w:left="4320" w:hanging="360"/>
-      </w:pPr>
-      <w:rPr>
-        <w:rFonts w:ascii="Symbol" w:hAnsi="Symbol" w:hint="default"/>
-      </w:rPr>
-    </w:lvl>
-    <w:lvl w:ilvl="6" w:tplc="340E8576" w:tentative="1">
-      <w:start w:val="1"/>
-      <w:numFmt w:val="bullet"/>
-      <w:lvlText w:val=""/>
-      <w:lvlJc w:val="left"/>
-      <w:pPr>
-        <w:tabs>
-          <w:tab w:val="num" w:pos="5040"/>
-        </w:tabs>
-        <w:ind w:left="5040" w:hanging="360"/>
-      </w:pPr>
-      <w:rPr>
-        <w:rFonts w:ascii="Symbol" w:hAnsi="Symbol" w:hint="default"/>
-      </w:rPr>
-    </w:lvl>
-    <w:lvl w:ilvl="7" w:tplc="74F0B062" w:tentative="1">
-      <w:start w:val="1"/>
-      <w:numFmt w:val="bullet"/>
-      <w:lvlText w:val=""/>
-      <w:lvlJc w:val="left"/>
-      <w:pPr>
-        <w:tabs>
-          <w:tab w:val="num" w:pos="5760"/>
-        </w:tabs>
-        <w:ind w:left="5760" w:hanging="360"/>
-      </w:pPr>
-      <w:rPr>
-        <w:rFonts w:ascii="Symbol" w:hAnsi="Symbol" w:hint="default"/>
-      </w:rPr>
-    </w:lvl>
-    <w:lvl w:ilvl="8" w:tplc="284896D8" w:tentative="1">
-      <w:start w:val="1"/>
-      <w:numFmt w:val="bullet"/>
-      <w:lvlText w:val=""/>
-      <w:lvlJc w:val="left"/>
-      <w:pPr>
-        <w:tabs>
-          <w:tab w:val="num" w:pos="6480"/>
-        </w:tabs>
-        <w:ind w:left="6480" w:hanging="360"/>
-      </w:pPr>
-      <w:rPr>
-        <w:rFonts w:ascii="Symbol" w:hAnsi="Symbol" w:hint="default"/>
-      </w:rPr>
-    </w:lvl>
-  </w:abstractNum>
-  <w:abstractNum w:abstractNumId="2" w15:restartNumberingAfterBreak="0">
-    <w:nsid w:val="321511F1"/>
-    <w:multiLevelType w:val="multilevel"/>
-    <w:tmpl w:val="B48294FA"/>
-    <w:lvl w:ilvl="0">
-      <w:start w:val="8"/>
-      <w:numFmt w:val="decimal"/>
-      <w:lvlText w:val="%1."/>
-      <w:lvlJc w:val="left"/>
-      <w:pPr>
-        <w:ind w:left="720" w:hanging="360"/>
-      </w:pPr>
-      <w:rPr>
-        <w:rFonts w:hint="default"/>
-        <w:b/>
-        <w:bCs w:val="0"/>
-        <w:i w:val="0"/>
-        <w:iCs w:val="0"/>
-        <w:color w:val="000000"/>
-      </w:rPr>
-    </w:lvl>
-    <w:lvl w:ilvl="1">
-      <w:start w:val="1"/>
-      <w:numFmt w:val="decimal"/>
-      <w:isLgl/>
-      <w:lvlText w:val="%1.%2"/>
-      <w:lvlJc w:val="left"/>
-      <w:pPr>
-        <w:ind w:left="720" w:hanging="360"/>
-      </w:pPr>
-      <w:rPr>
-        <w:rFonts w:hint="default"/>
-      </w:rPr>
-    </w:lvl>
-    <w:lvl w:ilvl="2">
-      <w:start w:val="1"/>
-      <w:numFmt w:val="decimal"/>
-      <w:isLgl/>
-      <w:lvlText w:val="%1.%2.%3"/>
-      <w:lvlJc w:val="left"/>
-      <w:pPr>
-        <w:ind w:left="1080" w:hanging="720"/>
-      </w:pPr>
-      <w:rPr>
-        <w:rFonts w:hint="default"/>
-      </w:rPr>
-    </w:lvl>
-    <w:lvl w:ilvl="3">
-      <w:start w:val="1"/>
-      <w:numFmt w:val="decimal"/>
-      <w:isLgl/>
-      <w:lvlText w:val="%1.%2.%3.%4"/>
-      <w:lvlJc w:val="left"/>
-      <w:pPr>
-        <w:ind w:left="1080" w:hanging="720"/>
-      </w:pPr>
-      <w:rPr>
-        <w:rFonts w:hint="default"/>
-      </w:rPr>
-    </w:lvl>
-    <w:lvl w:ilvl="4">
-      <w:start w:val="1"/>
-      <w:numFmt w:val="decimal"/>
-      <w:isLgl/>
-      <w:lvlText w:val="%1.%2.%3.%4.%5"/>
-      <w:lvlJc w:val="left"/>
-      <w:pPr>
-        <w:ind w:left="1440" w:hanging="1080"/>
-      </w:pPr>
-      <w:rPr>
-        <w:rFonts w:hint="default"/>
-      </w:rPr>
-    </w:lvl>
-    <w:lvl w:ilvl="5">
-      <w:start w:val="1"/>
-      <w:numFmt w:val="decimal"/>
-      <w:isLgl/>
-      <w:lvlText w:val="%1.%2.%3.%4.%5.%6"/>
-      <w:lvlJc w:val="left"/>
-      <w:pPr>
-        <w:ind w:left="1440" w:hanging="1080"/>
-      </w:pPr>
-      <w:rPr>
-        <w:rFonts w:hint="default"/>
-      </w:rPr>
-    </w:lvl>
-    <w:lvl w:ilvl="6">
-      <w:start w:val="1"/>
-      <w:numFmt w:val="decimal"/>
-      <w:isLgl/>
-      <w:lvlText w:val="%1.%2.%3.%4.%5.%6.%7"/>
-      <w:lvlJc w:val="left"/>
-      <w:pPr>
-        <w:ind w:left="1800" w:hanging="1440"/>
-      </w:pPr>
-      <w:rPr>
-        <w:rFonts w:hint="default"/>
-      </w:rPr>
-    </w:lvl>
-    <w:lvl w:ilvl="7">
-      <w:start w:val="1"/>
-      <w:numFmt w:val="decimal"/>
-      <w:isLgl/>
-      <w:lvlText w:val="%1.%2.%3.%4.%5.%6.%7.%8"/>
-      <w:lvlJc w:val="left"/>
-      <w:pPr>
-        <w:ind w:left="1800" w:hanging="1440"/>
-      </w:pPr>
-      <w:rPr>
-        <w:rFonts w:hint="default"/>
-      </w:rPr>
-    </w:lvl>
-    <w:lvl w:ilvl="8">
-      <w:start w:val="1"/>
-      <w:numFmt w:val="decimal"/>
-      <w:isLgl/>
-      <w:lvlText w:val="%1.%2.%3.%4.%5.%6.%7.%8.%9"/>
-      <w:lvlJc w:val="left"/>
-      <w:pPr>
-        <w:ind w:left="2160" w:hanging="1800"/>
-      </w:pPr>
-      <w:rPr>
-        <w:rFonts w:hint="default"/>
-      </w:rPr>
-    </w:lvl>
-  </w:abstractNum>
-  <w:abstractNum w:abstractNumId="3" w15:restartNumberingAfterBreak="0">
-    <w:nsid w:val="3B3778C1"/>
-    <w:multiLevelType w:val="multilevel"/>
-    <w:tmpl w:val="71287DBA"/>
-    <w:lvl w:ilvl="0">
-      <w:start w:val="1"/>
-      <w:numFmt w:val="bullet"/>
-      <w:lvlText w:val=""/>
-      <w:lvlJc w:val="left"/>
-      <w:pPr>
-        <w:tabs>
-          <w:tab w:val="num" w:pos="720"/>
-        </w:tabs>
-        <w:ind w:left="720" w:hanging="360"/>
-      </w:pPr>
-      <w:rPr>
-        <w:rFonts w:ascii="Symbol" w:hAnsi="Symbol" w:hint="default"/>
-        <w:sz w:val="20"/>
-      </w:rPr>
-    </w:lvl>
-    <w:lvl w:ilvl="1" w:tentative="1">
-      <w:start w:val="1"/>
-      <w:numFmt w:val="bullet"/>
-      <w:lvlText w:val="o"/>
-      <w:lvlJc w:val="left"/>
-      <w:pPr>
-        <w:tabs>
-          <w:tab w:val="num" w:pos="1440"/>
-        </w:tabs>
-        <w:ind w:left="1440" w:hanging="360"/>
-      </w:pPr>
-      <w:rPr>
-        <w:rFonts w:ascii="Courier New" w:hAnsi="Courier New" w:hint="default"/>
-        <w:sz w:val="20"/>
-      </w:rPr>
-    </w:lvl>
-    <w:lvl w:ilvl="2" w:tentative="1">
-      <w:start w:val="1"/>
-      <w:numFmt w:val="bullet"/>
-      <w:lvlText w:val=""/>
-      <w:lvlJc w:val="left"/>
-      <w:pPr>
-        <w:tabs>
-          <w:tab w:val="num" w:pos="2160"/>
-        </w:tabs>
-        <w:ind w:left="2160" w:hanging="360"/>
-      </w:pPr>
-      <w:rPr>
-        <w:rFonts w:ascii="Wingdings" w:hAnsi="Wingdings" w:hint="default"/>
-        <w:sz w:val="20"/>
-      </w:rPr>
-    </w:lvl>
-    <w:lvl w:ilvl="3" w:tentative="1">
-      <w:start w:val="1"/>
-      <w:numFmt w:val="bullet"/>
-      <w:lvlText w:val=""/>
-      <w:lvlJc w:val="left"/>
-      <w:pPr>
-        <w:tabs>
-          <w:tab w:val="num" w:pos="2880"/>
-        </w:tabs>
-        <w:ind w:left="2880" w:hanging="360"/>
-      </w:pPr>
-      <w:rPr>
-        <w:rFonts w:ascii="Wingdings" w:hAnsi="Wingdings" w:hint="default"/>
-        <w:sz w:val="20"/>
-      </w:rPr>
-    </w:lvl>
-    <w:lvl w:ilvl="4" w:tentative="1">
-      <w:start w:val="1"/>
-      <w:numFmt w:val="bullet"/>
-      <w:lvlText w:val=""/>
-      <w:lvlJc w:val="left"/>
-      <w:pPr>
-        <w:tabs>
-          <w:tab w:val="num" w:pos="3600"/>
-        </w:tabs>
-        <w:ind w:left="3600" w:hanging="360"/>
-      </w:pPr>
-      <w:rPr>
-        <w:rFonts w:ascii="Wingdings" w:hAnsi="Wingdings" w:hint="default"/>
-        <w:sz w:val="20"/>
-      </w:rPr>
-    </w:lvl>
-    <w:lvl w:ilvl="5" w:tentative="1">
-      <w:start w:val="1"/>
-      <w:numFmt w:val="bullet"/>
-      <w:lvlText w:val=""/>
-      <w:lvlJc w:val="left"/>
-      <w:pPr>
-        <w:tabs>
-          <w:tab w:val="num" w:pos="4320"/>
-        </w:tabs>
-        <w:ind w:left="4320" w:hanging="360"/>
-      </w:pPr>
-      <w:rPr>
-        <w:rFonts w:ascii="Wingdings" w:hAnsi="Wingdings" w:hint="default"/>
-        <w:sz w:val="20"/>
-      </w:rPr>
-    </w:lvl>
-    <w:lvl w:ilvl="6" w:tentative="1">
-      <w:start w:val="1"/>
-      <w:numFmt w:val="bullet"/>
-      <w:lvlText w:val=""/>
-      <w:lvlJc w:val="left"/>
-      <w:pPr>
-        <w:tabs>
-          <w:tab w:val="num" w:pos="5040"/>
-        </w:tabs>
-        <w:ind w:left="5040" w:hanging="360"/>
-      </w:pPr>
-      <w:rPr>
-        <w:rFonts w:ascii="Wingdings" w:hAnsi="Wingdings" w:hint="default"/>
-        <w:sz w:val="20"/>
-      </w:rPr>
-    </w:lvl>
-    <w:lvl w:ilvl="7" w:tentative="1">
-      <w:start w:val="1"/>
-      <w:numFmt w:val="bullet"/>
-      <w:lvlText w:val=""/>
-      <w:lvlJc w:val="left"/>
-      <w:pPr>
-        <w:tabs>
-          <w:tab w:val="num" w:pos="5760"/>
-        </w:tabs>
-        <w:ind w:left="5760" w:hanging="360"/>
-      </w:pPr>
-      <w:rPr>
-        <w:rFonts w:ascii="Wingdings" w:hAnsi="Wingdings" w:hint="default"/>
-        <w:sz w:val="20"/>
-      </w:rPr>
-    </w:lvl>
-    <w:lvl w:ilvl="8" w:tentative="1">
-      <w:start w:val="1"/>
-      <w:numFmt w:val="bullet"/>
-      <w:lvlText w:val=""/>
-      <w:lvlJc w:val="left"/>
-      <w:pPr>
-        <w:tabs>
-          <w:tab w:val="num" w:pos="6480"/>
-        </w:tabs>
-        <w:ind w:left="6480" w:hanging="360"/>
-      </w:pPr>
-      <w:rPr>
-        <w:rFonts w:ascii="Wingdings" w:hAnsi="Wingdings" w:hint="default"/>
-        <w:sz w:val="20"/>
-      </w:rPr>
-    </w:lvl>
-  </w:abstractNum>
-  <w:abstractNum w:abstractNumId="4" w15:restartNumberingAfterBreak="0">
-    <w:nsid w:val="553E73AA"/>
-    <w:multiLevelType w:val="hybridMultilevel"/>
-    <w:tmpl w:val="1E5ABADC"/>
-    <w:lvl w:ilvl="0" w:tplc="04090001">
-      <w:start w:val="1"/>
-      <w:numFmt w:val="bullet"/>
-      <w:lvlText w:val=""/>
-      <w:lvlJc w:val="left"/>
-      <w:pPr>
-        <w:ind w:left="1429" w:hanging="360"/>
-      </w:pPr>
-      <w:rPr>
-        <w:rFonts w:ascii="Symbol" w:hAnsi="Symbol" w:hint="default"/>
-      </w:rPr>
-    </w:lvl>
-    <w:lvl w:ilvl="1" w:tplc="04090003">
-      <w:start w:val="1"/>
-      <w:numFmt w:val="bullet"/>
-      <w:lvlText w:val="o"/>
-      <w:lvlJc w:val="left"/>
-      <w:pPr>
-        <w:ind w:left="2149" w:hanging="360"/>
-      </w:pPr>
-      <w:rPr>
-        <w:rFonts w:ascii="Courier New" w:hAnsi="Courier New" w:cs="Courier New" w:hint="default"/>
-      </w:rPr>
-    </w:lvl>
-    <w:lvl w:ilvl="2" w:tplc="04090005" w:tentative="1">
-      <w:start w:val="1"/>
-      <w:numFmt w:val="bullet"/>
-      <w:lvlText w:val=""/>
-      <w:lvlJc w:val="left"/>
-      <w:pPr>
-        <w:ind w:left="2869" w:hanging="360"/>
-      </w:pPr>
-      <w:rPr>
-        <w:rFonts w:ascii="Wingdings" w:hAnsi="Wingdings" w:hint="default"/>
-      </w:rPr>
-    </w:lvl>
-    <w:lvl w:ilvl="3" w:tplc="04090001" w:tentative="1">
-      <w:start w:val="1"/>
-      <w:numFmt w:val="bullet"/>
-      <w:lvlText w:val=""/>
-      <w:lvlJc w:val="left"/>
-      <w:pPr>
-        <w:ind w:left="3589" w:hanging="360"/>
-      </w:pPr>
-      <w:rPr>
-        <w:rFonts w:ascii="Symbol" w:hAnsi="Symbol" w:hint="default"/>
-      </w:rPr>
-    </w:lvl>
-    <w:lvl w:ilvl="4" w:tplc="04090003" w:tentative="1">
-      <w:start w:val="1"/>
-      <w:numFmt w:val="bullet"/>
-      <w:lvlText w:val="o"/>
-      <w:lvlJc w:val="left"/>
-      <w:pPr>
-        <w:ind w:left="4309" w:hanging="360"/>
-      </w:pPr>
-      <w:rPr>
-        <w:rFonts w:ascii="Courier New" w:hAnsi="Courier New" w:cs="Courier New" w:hint="default"/>
-      </w:rPr>
-    </w:lvl>
-    <w:lvl w:ilvl="5" w:tplc="04090005" w:tentative="1">
-      <w:start w:val="1"/>
-      <w:numFmt w:val="bullet"/>
-      <w:lvlText w:val=""/>
-      <w:lvlJc w:val="left"/>
-      <w:pPr>
-        <w:ind w:left="5029" w:hanging="360"/>
-      </w:pPr>
-      <w:rPr>
-        <w:rFonts w:ascii="Wingdings" w:hAnsi="Wingdings" w:hint="default"/>
-      </w:rPr>
-    </w:lvl>
-    <w:lvl w:ilvl="6" w:tplc="04090001" w:tentative="1">
-      <w:start w:val="1"/>
-      <w:numFmt w:val="bullet"/>
-      <w:lvlText w:val=""/>
-      <w:lvlJc w:val="left"/>
-      <w:pPr>
-        <w:ind w:left="5749" w:hanging="360"/>
-      </w:pPr>
-      <w:rPr>
-        <w:rFonts w:ascii="Symbol" w:hAnsi="Symbol" w:hint="default"/>
-      </w:rPr>
-    </w:lvl>
-    <w:lvl w:ilvl="7" w:tplc="04090003" w:tentative="1">
-      <w:start w:val="1"/>
-      <w:numFmt w:val="bullet"/>
-      <w:lvlText w:val="o"/>
-      <w:lvlJc w:val="left"/>
-      <w:pPr>
-        <w:ind w:left="6469" w:hanging="360"/>
-      </w:pPr>
-      <w:rPr>
-        <w:rFonts w:ascii="Courier New" w:hAnsi="Courier New" w:cs="Courier New" w:hint="default"/>
-      </w:rPr>
-    </w:lvl>
-    <w:lvl w:ilvl="8" w:tplc="04090005" w:tentative="1">
-      <w:start w:val="1"/>
-      <w:numFmt w:val="bullet"/>
-      <w:lvlText w:val=""/>
-      <w:lvlJc w:val="left"/>
-      <w:pPr>
-        <w:ind w:left="7189" w:hanging="360"/>
-      </w:pPr>
-      <w:rPr>
-        <w:rFonts w:ascii="Wingdings" w:hAnsi="Wingdings" w:hint="default"/>
-      </w:rPr>
-    </w:lvl>
-  </w:abstractNum>
-  <w:abstractNum w:abstractNumId="5" w15:restartNumberingAfterBreak="0">
-    <w:nsid w:val="5D747234"/>
-    <w:multiLevelType w:val="hybridMultilevel"/>
-    <w:tmpl w:val="52A877B6"/>
-    <w:lvl w:ilvl="0" w:tplc="217AB618">
-      <w:start w:val="7"/>
-      <w:numFmt w:val="decimal"/>
-      <w:lvlText w:val="%1"/>
-      <w:lvlJc w:val="left"/>
-      <w:pPr>
-        <w:ind w:left="720" w:hanging="360"/>
-      </w:pPr>
-      <w:rPr>
-        <w:rFonts w:hint="default"/>
-      </w:rPr>
-    </w:lvl>
-    <w:lvl w:ilvl="1" w:tplc="40090019" w:tentative="1">
-      <w:start w:val="1"/>
-      <w:numFmt w:val="lowerLetter"/>
-      <w:lvlText w:val="%2."/>
-      <w:lvlJc w:val="left"/>
-      <w:pPr>
-        <w:ind w:left="1440" w:hanging="360"/>
-      </w:pPr>
-    </w:lvl>
-    <w:lvl w:ilvl="2" w:tplc="4009001B" w:tentative="1">
-      <w:start w:val="1"/>
-      <w:numFmt w:val="lowerRoman"/>
-      <w:lvlText w:val="%3."/>
-      <w:lvlJc w:val="right"/>
-      <w:pPr>
-        <w:ind w:left="2160" w:hanging="180"/>
-      </w:pPr>
-    </w:lvl>
-    <w:lvl w:ilvl="3" w:tplc="4009000F" w:tentative="1">
-      <w:start w:val="1"/>
-      <w:numFmt w:val="decimal"/>
-      <w:lvlText w:val="%4."/>
-      <w:lvlJc w:val="left"/>
-      <w:pPr>
-        <w:ind w:left="2880" w:hanging="360"/>
-      </w:pPr>
-    </w:lvl>
-    <w:lvl w:ilvl="4" w:tplc="40090019" w:tentative="1">
-      <w:start w:val="1"/>
-      <w:numFmt w:val="lowerLetter"/>
-      <w:lvlText w:val="%5."/>
-      <w:lvlJc w:val="left"/>
-      <w:pPr>
-        <w:ind w:left="3600" w:hanging="360"/>
-      </w:pPr>
-    </w:lvl>
-    <w:lvl w:ilvl="5" w:tplc="4009001B" w:tentative="1">
-      <w:start w:val="1"/>
-      <w:numFmt w:val="lowerRoman"/>
-      <w:lvlText w:val="%6."/>
-      <w:lvlJc w:val="right"/>
-      <w:pPr>
-        <w:ind w:left="4320" w:hanging="180"/>
-      </w:pPr>
-    </w:lvl>
-    <w:lvl w:ilvl="6" w:tplc="4009000F" w:tentative="1">
-      <w:start w:val="1"/>
-      <w:numFmt w:val="decimal"/>
-      <w:lvlText w:val="%7."/>
-      <w:lvlJc w:val="left"/>
-      <w:pPr>
-        <w:ind w:left="5040" w:hanging="360"/>
-      </w:pPr>
-    </w:lvl>
-    <w:lvl w:ilvl="7" w:tplc="40090019" w:tentative="1">
-      <w:start w:val="1"/>
-      <w:numFmt w:val="lowerLetter"/>
-      <w:lvlText w:val="%8."/>
-      <w:lvlJc w:val="left"/>
-      <w:pPr>
-        <w:ind w:left="5760" w:hanging="360"/>
-      </w:pPr>
-    </w:lvl>
-    <w:lvl w:ilvl="8" w:tplc="4009001B" w:tentative="1">
-      <w:start w:val="1"/>
-      <w:numFmt w:val="lowerRoman"/>
-      <w:lvlText w:val="%9."/>
-      <w:lvlJc w:val="right"/>
-      <w:pPr>
-        <w:ind w:left="6480" w:hanging="180"/>
-      </w:pPr>
-    </w:lvl>
-  </w:abstractNum>
-  <w:abstractNum w:abstractNumId="6" w15:restartNumberingAfterBreak="0">
-    <w:nsid w:val="778D22ED"/>
-    <w:multiLevelType w:val="hybridMultilevel"/>
-    <w:tmpl w:val="2640E3FA"/>
-    <w:lvl w:ilvl="0" w:tplc="40090001">
-      <w:start w:val="1"/>
-      <w:numFmt w:val="bullet"/>
-      <w:lvlText w:val=""/>
-      <w:lvlJc w:val="left"/>
-      <w:pPr>
-        <w:ind w:left="720" w:hanging="360"/>
-      </w:pPr>
-      <w:rPr>
-        <w:rFonts w:ascii="Symbol" w:hAnsi="Symbol" w:hint="default"/>
-      </w:rPr>
-    </w:lvl>
-    <w:lvl w:ilvl="1" w:tplc="40090003" w:tentative="1">
-      <w:start w:val="1"/>
-      <w:numFmt w:val="bullet"/>
-      <w:lvlText w:val="o"/>
-      <w:lvlJc w:val="left"/>
-      <w:pPr>
-        <w:ind w:left="1440" w:hanging="360"/>
-      </w:pPr>
-      <w:rPr>
-        <w:rFonts w:ascii="Courier New" w:hAnsi="Courier New" w:cs="Courier New" w:hint="default"/>
-      </w:rPr>
-    </w:lvl>
-    <w:lvl w:ilvl="2" w:tplc="40090005" w:tentative="1">
-      <w:start w:val="1"/>
-      <w:numFmt w:val="bullet"/>
-      <w:lvlText w:val=""/>
-      <w:lvlJc w:val="left"/>
-      <w:pPr>
-        <w:ind w:left="2160" w:hanging="360"/>
-      </w:pPr>
-      <w:rPr>
-        <w:rFonts w:ascii="Wingdings" w:hAnsi="Wingdings" w:hint="default"/>
-      </w:rPr>
-    </w:lvl>
-    <w:lvl w:ilvl="3" w:tplc="40090001" w:tentative="1">
-      <w:start w:val="1"/>
-      <w:numFmt w:val="bullet"/>
-      <w:lvlText w:val=""/>
-      <w:lvlJc w:val="left"/>
-      <w:pPr>
-        <w:ind w:left="2880" w:hanging="360"/>
-      </w:pPr>
-      <w:rPr>
-        <w:rFonts w:ascii="Symbol" w:hAnsi="Symbol" w:hint="default"/>
-      </w:rPr>
-    </w:lvl>
-    <w:lvl w:ilvl="4" w:tplc="40090003" w:tentative="1">
-      <w:start w:val="1"/>
-      <w:numFmt w:val="bullet"/>
-      <w:lvlText w:val="o"/>
-      <w:lvlJc w:val="left"/>
-      <w:pPr>
-        <w:ind w:left="3600" w:hanging="360"/>
-      </w:pPr>
-      <w:rPr>
-        <w:rFonts w:ascii="Courier New" w:hAnsi="Courier New" w:cs="Courier New" w:hint="default"/>
-      </w:rPr>
-    </w:lvl>
-    <w:lvl w:ilvl="5" w:tplc="40090005" w:tentative="1">
-      <w:start w:val="1"/>
-      <w:numFmt w:val="bullet"/>
-      <w:lvlText w:val=""/>
-      <w:lvlJc w:val="left"/>
-      <w:pPr>
-        <w:ind w:left="4320" w:hanging="360"/>
-      </w:pPr>
-      <w:rPr>
-        <w:rFonts w:ascii="Wingdings" w:hAnsi="Wingdings" w:hint="default"/>
-      </w:rPr>
-    </w:lvl>
-    <w:lvl w:ilvl="6" w:tplc="40090001" w:tentative="1">
-      <w:start w:val="1"/>
-      <w:numFmt w:val="bullet"/>
-      <w:lvlText w:val=""/>
-      <w:lvlJc w:val="left"/>
-      <w:pPr>
-        <w:ind w:left="5040" w:hanging="360"/>
-      </w:pPr>
-      <w:rPr>
-        <w:rFonts w:ascii="Symbol" w:hAnsi="Symbol" w:hint="default"/>
-      </w:rPr>
-    </w:lvl>
-    <w:lvl w:ilvl="7" w:tplc="40090003" w:tentative="1">
-      <w:start w:val="1"/>
-      <w:numFmt w:val="bullet"/>
-      <w:lvlText w:val="o"/>
-      <w:lvlJc w:val="left"/>
-      <w:pPr>
-        <w:ind w:left="5760" w:hanging="360"/>
-      </w:pPr>
-      <w:rPr>
-        <w:rFonts w:ascii="Courier New" w:hAnsi="Courier New" w:cs="Courier New" w:hint="default"/>
-      </w:rPr>
-    </w:lvl>
-    <w:lvl w:ilvl="8" w:tplc="40090005" w:tentative="1">
-      <w:start w:val="1"/>
-      <w:numFmt w:val="bullet"/>
-      <w:lvlText w:val=""/>
-      <w:lvlJc w:val="left"/>
-      <w:pPr>
-        <w:ind w:left="6480" w:hanging="360"/>
-      </w:pPr>
-      <w:rPr>
-        <w:rFonts w:ascii="Wingdings" w:hAnsi="Wingdings" w:hint="default"/>
-      </w:rPr>
-    </w:lvl>
-  </w:abstractNum>
-  <w:abstractNum w:abstractNumId="7" w15:restartNumberingAfterBreak="0">
-    <w:nsid w:val="7BC03AB7"/>
-    <w:multiLevelType w:val="hybridMultilevel"/>
-    <w:tmpl w:val="4DB0D710"/>
-    <w:lvl w:ilvl="0" w:tplc="39EC92DC">
-      <w:start w:val="1"/>
-      <w:numFmt w:val="decimal"/>
-      <w:lvlText w:val="%1."/>
-      <w:lvlJc w:val="left"/>
-      <w:pPr>
-        <w:ind w:left="786" w:hanging="360"/>
-      </w:pPr>
-      <w:rPr>
-        <w:rFonts w:ascii="Times New Roman" w:hAnsi="Times New Roman" w:cs="Times New Roman" w:hint="default"/>
-        <w:b/>
-        <w:bCs/>
-        <w:sz w:val="22"/>
-        <w:szCs w:val="22"/>
-      </w:rPr>
-    </w:lvl>
-    <w:lvl w:ilvl="1" w:tplc="04090019">
-      <w:start w:val="1"/>
-      <w:numFmt w:val="lowerLetter"/>
-      <w:lvlText w:val="%2."/>
-      <w:lvlJc w:val="left"/>
-      <w:pPr>
-        <w:ind w:left="1440" w:hanging="360"/>
-      </w:pPr>
-    </w:lvl>
-    <w:lvl w:ilvl="2" w:tplc="0409001B" w:tentative="1">
-      <w:start w:val="1"/>
-      <w:numFmt w:val="lowerRoman"/>
-      <w:lvlText w:val="%3."/>
-      <w:lvlJc w:val="right"/>
-      <w:pPr>
-        <w:ind w:left="2160" w:hanging="180"/>
-      </w:pPr>
-    </w:lvl>
-    <w:lvl w:ilvl="3" w:tplc="0409000F" w:tentative="1">
-      <w:start w:val="1"/>
-      <w:numFmt w:val="decimal"/>
-      <w:lvlText w:val="%4."/>
-      <w:lvlJc w:val="left"/>
-      <w:pPr>
-        <w:ind w:left="2880" w:hanging="360"/>
-      </w:pPr>
-    </w:lvl>
-    <w:lvl w:ilvl="4" w:tplc="04090019" w:tentative="1">
-      <w:start w:val="1"/>
-      <w:numFmt w:val="lowerLetter"/>
-      <w:lvlText w:val="%5."/>
-      <w:lvlJc w:val="left"/>
-      <w:pPr>
-        <w:ind w:left="3600" w:hanging="360"/>
-      </w:pPr>
-    </w:lvl>
-    <w:lvl w:ilvl="5" w:tplc="0409001B" w:tentative="1">
-      <w:start w:val="1"/>
-      <w:numFmt w:val="lowerRoman"/>
-      <w:lvlText w:val="%6."/>
-      <w:lvlJc w:val="right"/>
-      <w:pPr>
-        <w:ind w:left="4320" w:hanging="180"/>
-      </w:pPr>
-    </w:lvl>
-    <w:lvl w:ilvl="6" w:tplc="0409000F" w:tentative="1">
-      <w:start w:val="1"/>
-      <w:numFmt w:val="decimal"/>
-      <w:lvlText w:val="%7."/>
-      <w:lvlJc w:val="left"/>
-      <w:pPr>
-        <w:ind w:left="5040" w:hanging="360"/>
-      </w:pPr>
-    </w:lvl>
-    <w:lvl w:ilvl="7" w:tplc="04090019" w:tentative="1">
-      <w:start w:val="1"/>
-      <w:numFmt w:val="lowerLetter"/>
-      <w:lvlText w:val="%8."/>
-      <w:lvlJc w:val="left"/>
-      <w:pPr>
-        <w:ind w:left="5760" w:hanging="360"/>
-      </w:pPr>
-    </w:lvl>
-    <w:lvl w:ilvl="8" w:tplc="0409001B" w:tentative="1">
-      <w:start w:val="1"/>
-      <w:numFmt w:val="lowerRoman"/>
-      <w:lvlText w:val="%9."/>
-      <w:lvlJc w:val="right"/>
-      <w:pPr>
-        <w:ind w:left="6480" w:hanging="180"/>
-      </w:pPr>
-    </w:lvl>
-  </w:abstractNum>
-  <w:num w:numId="1" w16cid:durableId="1381368897">
-    <w:abstractNumId w:val="7"/>
-  </w:num>
-  <w:num w:numId="2" w16cid:durableId="1542672168">
-    <w:abstractNumId w:val="4"/>
-  </w:num>
-  <w:num w:numId="3" w16cid:durableId="1546747729">
-    <w:abstractNumId w:val="1"/>
-  </w:num>
-  <w:num w:numId="4" w16cid:durableId="636685598">
-    <w:abstractNumId w:val="2"/>
-  </w:num>
-  <w:num w:numId="5" w16cid:durableId="312101973">
-    <w:abstractNumId w:val="5"/>
-  </w:num>
-  <w:num w:numId="6" w16cid:durableId="234780929">
-    <w:abstractNumId w:val="6"/>
-  </w:num>
-  <w:num w:numId="7" w16cid:durableId="1998799303">
-    <w:abstractNumId w:val="3"/>
-  </w:num>
-  <w:num w:numId="8" w16cid:durableId="2061705710">
+  <w:num w:numId="1" w16cid:durableId="2061705710">
     <w:abstractNumId w:val="0"/>
   </w:num>
 </w:numbering>
@@ -5020,7 +4549,7 @@
   <w:style w:type="paragraph" w:default="1" w:styleId="Normal">
     <w:name w:val="Normal"/>
     <w:qFormat/>
-    <w:rsid w:val="00E9559D"/>
+    <w:rsid w:val="00EB4006"/>
     <w:pPr>
       <w:spacing w:after="0" w:line="240" w:lineRule="auto"/>
     </w:pPr>
@@ -5038,7 +4567,7 @@
     <w:link w:val="Heading1Char"/>
     <w:uiPriority w:val="9"/>
     <w:qFormat/>
-    <w:rsid w:val="00444264"/>
+    <w:rsid w:val="00C02688"/>
     <w:pPr>
       <w:keepNext/>
       <w:keepLines/>
@@ -5061,7 +4590,7 @@
     <w:semiHidden/>
     <w:unhideWhenUsed/>
     <w:qFormat/>
-    <w:rsid w:val="00444264"/>
+    <w:rsid w:val="00C02688"/>
     <w:pPr>
       <w:keepNext/>
       <w:keepLines/>
@@ -5084,7 +4613,7 @@
     <w:semiHidden/>
     <w:unhideWhenUsed/>
     <w:qFormat/>
-    <w:rsid w:val="00444264"/>
+    <w:rsid w:val="00C02688"/>
     <w:pPr>
       <w:keepNext/>
       <w:keepLines/>
@@ -5107,7 +4636,7 @@
     <w:semiHidden/>
     <w:unhideWhenUsed/>
     <w:qFormat/>
-    <w:rsid w:val="00444264"/>
+    <w:rsid w:val="00C02688"/>
     <w:pPr>
       <w:keepNext/>
       <w:keepLines/>
@@ -5130,7 +4659,7 @@
     <w:semiHidden/>
     <w:unhideWhenUsed/>
     <w:qFormat/>
-    <w:rsid w:val="00444264"/>
+    <w:rsid w:val="00C02688"/>
     <w:pPr>
       <w:keepNext/>
       <w:keepLines/>
@@ -5151,7 +4680,7 @@
     <w:semiHidden/>
     <w:unhideWhenUsed/>
     <w:qFormat/>
-    <w:rsid w:val="00444264"/>
+    <w:rsid w:val="00C02688"/>
     <w:pPr>
       <w:keepNext/>
       <w:keepLines/>
@@ -5174,7 +4703,7 @@
     <w:semiHidden/>
     <w:unhideWhenUsed/>
     <w:qFormat/>
-    <w:rsid w:val="00444264"/>
+    <w:rsid w:val="00C02688"/>
     <w:pPr>
       <w:keepNext/>
       <w:keepLines/>
@@ -5195,7 +4724,7 @@
     <w:semiHidden/>
     <w:unhideWhenUsed/>
     <w:qFormat/>
-    <w:rsid w:val="00444264"/>
+    <w:rsid w:val="00C02688"/>
     <w:pPr>
       <w:keepNext/>
       <w:keepLines/>
@@ -5217,7 +4746,7 @@
     <w:semiHidden/>
     <w:unhideWhenUsed/>
     <w:qFormat/>
-    <w:rsid w:val="00444264"/>
+    <w:rsid w:val="00C02688"/>
     <w:pPr>
       <w:keepNext/>
       <w:keepLines/>
@@ -5260,7 +4789,7 @@
     <w:basedOn w:val="DefaultParagraphFont"/>
     <w:link w:val="Heading1"/>
     <w:uiPriority w:val="9"/>
-    <w:rsid w:val="00444264"/>
+    <w:rsid w:val="00C02688"/>
     <w:rPr>
       <w:rFonts w:asciiTheme="majorHAnsi" w:eastAsiaTheme="majorEastAsia" w:hAnsiTheme="majorHAnsi" w:cstheme="majorBidi"/>
       <w:color w:val="0F4761" w:themeColor="accent1" w:themeShade="BF"/>
@@ -5274,7 +4803,7 @@
     <w:link w:val="Heading2"/>
     <w:uiPriority w:val="9"/>
     <w:semiHidden/>
-    <w:rsid w:val="00444264"/>
+    <w:rsid w:val="00C02688"/>
     <w:rPr>
       <w:rFonts w:asciiTheme="majorHAnsi" w:eastAsiaTheme="majorEastAsia" w:hAnsiTheme="majorHAnsi" w:cstheme="majorBidi"/>
       <w:color w:val="0F4761" w:themeColor="accent1" w:themeShade="BF"/>
@@ -5288,7 +4817,7 @@
     <w:link w:val="Heading3"/>
     <w:uiPriority w:val="9"/>
     <w:semiHidden/>
-    <w:rsid w:val="00444264"/>
+    <w:rsid w:val="00C02688"/>
     <w:rPr>
       <w:rFonts w:eastAsiaTheme="majorEastAsia" w:cstheme="majorBidi"/>
       <w:color w:val="0F4761" w:themeColor="accent1" w:themeShade="BF"/>
@@ -5302,7 +4831,7 @@
     <w:link w:val="Heading4"/>
     <w:uiPriority w:val="9"/>
     <w:semiHidden/>
-    <w:rsid w:val="00444264"/>
+    <w:rsid w:val="00C02688"/>
     <w:rPr>
       <w:rFonts w:eastAsiaTheme="majorEastAsia" w:cstheme="majorBidi"/>
       <w:i/>
@@ -5316,7 +4845,7 @@
     <w:link w:val="Heading5"/>
     <w:uiPriority w:val="9"/>
     <w:semiHidden/>
-    <w:rsid w:val="00444264"/>
+    <w:rsid w:val="00C02688"/>
     <w:rPr>
       <w:rFonts w:eastAsiaTheme="majorEastAsia" w:cstheme="majorBidi"/>
       <w:color w:val="0F4761" w:themeColor="accent1" w:themeShade="BF"/>
@@ -5328,7 +4857,7 @@
     <w:link w:val="Heading6"/>
     <w:uiPriority w:val="9"/>
     <w:semiHidden/>
-    <w:rsid w:val="00444264"/>
+    <w:rsid w:val="00C02688"/>
     <w:rPr>
       <w:rFonts w:eastAsiaTheme="majorEastAsia" w:cstheme="majorBidi"/>
       <w:i/>
@@ -5342,7 +4871,7 @@
     <w:link w:val="Heading7"/>
     <w:uiPriority w:val="9"/>
     <w:semiHidden/>
-    <w:rsid w:val="00444264"/>
+    <w:rsid w:val="00C02688"/>
     <w:rPr>
       <w:rFonts w:eastAsiaTheme="majorEastAsia" w:cstheme="majorBidi"/>
       <w:color w:val="595959" w:themeColor="text1" w:themeTint="A6"/>
@@ -5354,7 +4883,7 @@
     <w:link w:val="Heading8"/>
     <w:uiPriority w:val="9"/>
     <w:semiHidden/>
-    <w:rsid w:val="00444264"/>
+    <w:rsid w:val="00C02688"/>
     <w:rPr>
       <w:rFonts w:eastAsiaTheme="majorEastAsia" w:cstheme="majorBidi"/>
       <w:i/>
@@ -5368,7 +4897,7 @@
     <w:link w:val="Heading9"/>
     <w:uiPriority w:val="9"/>
     <w:semiHidden/>
-    <w:rsid w:val="00444264"/>
+    <w:rsid w:val="00C02688"/>
     <w:rPr>
       <w:rFonts w:eastAsiaTheme="majorEastAsia" w:cstheme="majorBidi"/>
       <w:color w:val="272727" w:themeColor="text1" w:themeTint="D8"/>
@@ -5381,7 +4910,7 @@
     <w:link w:val="TitleChar"/>
     <w:uiPriority w:val="10"/>
     <w:qFormat/>
-    <w:rsid w:val="00444264"/>
+    <w:rsid w:val="00C02688"/>
     <w:pPr>
       <w:spacing w:after="80"/>
       <w:contextualSpacing/>
@@ -5399,7 +4928,7 @@
     <w:basedOn w:val="DefaultParagraphFont"/>
     <w:link w:val="Title"/>
     <w:uiPriority w:val="10"/>
-    <w:rsid w:val="00444264"/>
+    <w:rsid w:val="00C02688"/>
     <w:rPr>
       <w:rFonts w:asciiTheme="majorHAnsi" w:eastAsiaTheme="majorEastAsia" w:hAnsiTheme="majorHAnsi" w:cstheme="majorBidi"/>
       <w:spacing w:val="-10"/>
@@ -5415,7 +4944,7 @@
     <w:link w:val="SubtitleChar"/>
     <w:uiPriority w:val="11"/>
     <w:qFormat/>
-    <w:rsid w:val="00444264"/>
+    <w:rsid w:val="00C02688"/>
     <w:pPr>
       <w:numPr>
         <w:ilvl w:val="1"/>
@@ -5434,7 +4963,7 @@
     <w:basedOn w:val="DefaultParagraphFont"/>
     <w:link w:val="Subtitle"/>
     <w:uiPriority w:val="11"/>
-    <w:rsid w:val="00444264"/>
+    <w:rsid w:val="00C02688"/>
     <w:rPr>
       <w:rFonts w:eastAsiaTheme="majorEastAsia" w:cstheme="majorBidi"/>
       <w:color w:val="595959" w:themeColor="text1" w:themeTint="A6"/>
@@ -5450,7 +4979,7 @@
     <w:link w:val="QuoteChar"/>
     <w:uiPriority w:val="29"/>
     <w:qFormat/>
-    <w:rsid w:val="00444264"/>
+    <w:rsid w:val="00C02688"/>
     <w:pPr>
       <w:spacing w:before="160"/>
       <w:jc w:val="center"/>
@@ -5466,7 +4995,7 @@
     <w:basedOn w:val="DefaultParagraphFont"/>
     <w:link w:val="Quote"/>
     <w:uiPriority w:val="29"/>
-    <w:rsid w:val="00444264"/>
+    <w:rsid w:val="00C02688"/>
     <w:rPr>
       <w:i/>
       <w:iCs/>
@@ -5479,7 +5008,7 @@
     <w:link w:val="ListParagraphChar"/>
     <w:uiPriority w:val="34"/>
     <w:qFormat/>
-    <w:rsid w:val="00444264"/>
+    <w:rsid w:val="00C02688"/>
     <w:pPr>
       <w:ind w:left="720"/>
       <w:contextualSpacing/>
@@ -5490,7 +5019,7 @@
     <w:basedOn w:val="DefaultParagraphFont"/>
     <w:uiPriority w:val="21"/>
     <w:qFormat/>
-    <w:rsid w:val="00444264"/>
+    <w:rsid w:val="00C02688"/>
     <w:rPr>
       <w:i/>
       <w:iCs/>
@@ -5504,7 +5033,7 @@
     <w:link w:val="IntenseQuoteChar"/>
     <w:uiPriority w:val="30"/>
     <w:qFormat/>
-    <w:rsid w:val="00444264"/>
+    <w:rsid w:val="00C02688"/>
     <w:pPr>
       <w:pBdr>
         <w:top w:val="single" w:sz="4" w:space="10" w:color="0F4761" w:themeColor="accent1" w:themeShade="BF"/>
@@ -5525,7 +5054,7 @@
     <w:basedOn w:val="DefaultParagraphFont"/>
     <w:link w:val="IntenseQuote"/>
     <w:uiPriority w:val="30"/>
-    <w:rsid w:val="00444264"/>
+    <w:rsid w:val="00C02688"/>
     <w:rPr>
       <w:i/>
       <w:iCs/>
@@ -5537,7 +5066,7 @@
     <w:basedOn w:val="DefaultParagraphFont"/>
     <w:uiPriority w:val="32"/>
     <w:qFormat/>
-    <w:rsid w:val="00444264"/>
+    <w:rsid w:val="00C02688"/>
     <w:rPr>
       <w:b/>
       <w:bCs/>
@@ -5552,7 +5081,7 @@
     <w:basedOn w:val="Normal"/>
     <w:link w:val="HeaderChar"/>
     <w:unhideWhenUsed/>
-    <w:rsid w:val="00E9559D"/>
+    <w:rsid w:val="00EB4006"/>
     <w:pPr>
       <w:tabs>
         <w:tab w:val="center" w:pos="4680"/>
@@ -5565,7 +5094,7 @@
     <w:aliases w:val="Header Char1 Char Char Char1,Header Char1 Char Char1,Header Char Char Char Char1,Header1... Char,Header Char Char Char1,Header1 Char Char,Header1 Char1,Header Char Char Char Char Char,Header Char1 Char Char Char Char,Header Char Cha Char"/>
     <w:basedOn w:val="DefaultParagraphFont"/>
     <w:link w:val="Header"/>
-    <w:rsid w:val="00E9559D"/>
+    <w:rsid w:val="00EB4006"/>
     <w:rPr>
       <w:rFonts w:ascii="Times New Roman" w:eastAsia="Times New Roman" w:hAnsi="Times New Roman" w:cs="Times New Roman"/>
       <w:kern w:val="0"/>
@@ -5579,7 +5108,7 @@
     <w:link w:val="FooterChar"/>
     <w:uiPriority w:val="99"/>
     <w:unhideWhenUsed/>
-    <w:rsid w:val="00E9559D"/>
+    <w:rsid w:val="00EB4006"/>
     <w:pPr>
       <w:tabs>
         <w:tab w:val="center" w:pos="4680"/>
@@ -5592,7 +5121,7 @@
     <w:basedOn w:val="DefaultParagraphFont"/>
     <w:link w:val="Footer"/>
     <w:uiPriority w:val="99"/>
-    <w:rsid w:val="00E9559D"/>
+    <w:rsid w:val="00EB4006"/>
     <w:rPr>
       <w:rFonts w:ascii="Times New Roman" w:eastAsia="Times New Roman" w:hAnsi="Times New Roman" w:cs="Times New Roman"/>
       <w:kern w:val="0"/>
@@ -5604,7 +5133,7 @@
     <w:name w:val="Table Grid"/>
     <w:basedOn w:val="TableNormal"/>
     <w:uiPriority w:val="59"/>
-    <w:rsid w:val="00E9559D"/>
+    <w:rsid w:val="00EB4006"/>
     <w:pPr>
       <w:spacing w:after="0" w:line="240" w:lineRule="auto"/>
     </w:pPr>
@@ -5631,63 +5160,22 @@
     <w:name w:val="List Paragraph Char"/>
     <w:link w:val="ListParagraph"/>
     <w:uiPriority w:val="34"/>
-    <w:rsid w:val="00E9559D"/>
+    <w:rsid w:val="00EB4006"/>
   </w:style>
   <w:style w:type="paragraph" w:styleId="NoSpacing">
     <w:name w:val="No Spacing"/>
-    <w:link w:val="NoSpacingChar"/>
     <w:uiPriority w:val="1"/>
     <w:qFormat/>
-    <w:rsid w:val="00E9559D"/>
+    <w:rsid w:val="00EB4006"/>
     <w:pPr>
       <w:spacing w:after="0" w:line="240" w:lineRule="auto"/>
     </w:pPr>
     <w:rPr>
-      <w:rFonts w:ascii="Calibri" w:eastAsia="Times New Roman" w:hAnsi="Calibri" w:cs="Times New Roman"/>
+      <w:rFonts w:ascii="Calibri" w:eastAsia="Calibri" w:hAnsi="Calibri" w:cs="Times New Roman"/>
       <w:kern w:val="0"/>
       <w:sz w:val="22"/>
       <w:szCs w:val="22"/>
       <w:lang w:val="en-US"/>
-      <w14:ligatures w14:val="none"/>
-    </w:rPr>
-  </w:style>
-  <w:style w:type="character" w:customStyle="1" w:styleId="NoSpacingChar">
-    <w:name w:val="No Spacing Char"/>
-    <w:link w:val="NoSpacing"/>
-    <w:uiPriority w:val="1"/>
-    <w:rsid w:val="00E9559D"/>
-    <w:rPr>
-      <w:rFonts w:ascii="Calibri" w:eastAsia="Times New Roman" w:hAnsi="Calibri" w:cs="Times New Roman"/>
-      <w:kern w:val="0"/>
-      <w:sz w:val="22"/>
-      <w:szCs w:val="22"/>
-      <w:lang w:val="en-US"/>
-      <w14:ligatures w14:val="none"/>
-    </w:rPr>
-  </w:style>
-  <w:style w:type="character" w:styleId="Strong">
-    <w:name w:val="Strong"/>
-    <w:uiPriority w:val="22"/>
-    <w:qFormat/>
-    <w:rsid w:val="00E9559D"/>
-    <w:rPr>
-      <w:b/>
-      <w:bCs/>
-    </w:rPr>
-  </w:style>
-  <w:style w:type="paragraph" w:customStyle="1" w:styleId="Default">
-    <w:name w:val="Default"/>
-    <w:rsid w:val="00E9559D"/>
-    <w:pPr>
-      <w:autoSpaceDE w:val="0"/>
-      <w:autoSpaceDN w:val="0"/>
-      <w:adjustRightInd w:val="0"/>
-      <w:spacing w:after="0" w:line="240" w:lineRule="auto"/>
-    </w:pPr>
-    <w:rPr>
-      <w:rFonts w:ascii="Times New Roman" w:eastAsia="Calibri" w:hAnsi="Times New Roman" w:cs="Times New Roman"/>
-      <w:color w:val="000000"/>
-      <w:kern w:val="0"/>
       <w14:ligatures w14:val="none"/>
     </w:rPr>
   </w:style>

</xml_diff>